<commit_message>
Align SRS and paper with PolyForm Noncommercial license
</commit_message>
<xml_diff>
--- a/deliverables/Q-RAG_Research_Paper.docx
+++ b/deliverables/Q-RAG_Research_Paper.docx
@@ -161,12 +161,11 @@
       <w:pPr>
         <w:pStyle w:val="Heading1"/>
       </w:pPr>
-      <w:bookmarkStart w:id="0" w:name="_Toc242873690"/>
+      <w:bookmarkStart w:id="0" w:name="_Toc242920568"/>
       <w:r>
         <w:rPr>
           <w:rFonts w:ascii="Times New Roman" w:hAnsi="Times New Roman" w:cs="Times New Roman"/>
         </w:rPr>
-        <w:lastRenderedPageBreak/>
         <w:t>Abstract</w:t>
       </w:r>
       <w:bookmarkEnd w:id="0"/>
@@ -224,13 +223,7 @@
           <w:tab w:val="right" w:leader="dot" w:pos="9350"/>
         </w:tabs>
         <w:rPr>
-          <w:rFonts w:asciiTheme="minorHAnsi" w:eastAsiaTheme="minorEastAsia" w:hAnsiTheme="minorHAnsi" w:cstheme="minorBidi"/>
           <w:noProof/>
-          <w:color w:val="auto"/>
-          <w:kern w:val="2"/>
-          <w:szCs w:val="24"/>
-          <w:lang w:val="en-IN" w:eastAsia="en-IN"/>
-          <w14:ligatures w14:val="standardContextual"/>
         </w:rPr>
       </w:pPr>
       <w:r>
@@ -242,7 +235,7 @@
       <w:r>
         <w:fldChar w:fldCharType="separate"/>
       </w:r>
-      <w:hyperlink w:anchor="_Toc242873690" w:history="1">
+      <w:hyperlink w:anchor="_Toc242920568" w:history="1">
         <w:r>
           <w:rPr>
             <w:rStyle w:val="Hyperlink"/>
@@ -269,7 +262,7 @@
             <w:noProof/>
             <w:webHidden/>
           </w:rPr>
-          <w:instrText xml:space="preserve"> PAGEREF _Toc242873690 \h </w:instrText>
+          <w:instrText xml:space="preserve"> PAGEREF _Toc242920568 \h </w:instrText>
         </w:r>
         <w:r>
           <w:rPr>
@@ -307,16 +300,10 @@
           <w:tab w:val="right" w:leader="dot" w:pos="9350"/>
         </w:tabs>
         <w:rPr>
-          <w:rFonts w:asciiTheme="minorHAnsi" w:eastAsiaTheme="minorEastAsia" w:hAnsiTheme="minorHAnsi" w:cstheme="minorBidi"/>
           <w:noProof/>
-          <w:color w:val="auto"/>
-          <w:kern w:val="2"/>
-          <w:szCs w:val="24"/>
-          <w:lang w:val="en-IN" w:eastAsia="en-IN"/>
-          <w14:ligatures w14:val="standardContextual"/>
         </w:rPr>
       </w:pPr>
-      <w:hyperlink w:anchor="_Toc242873691" w:history="1">
+      <w:hyperlink w:anchor="_Toc242920569" w:history="1">
         <w:r>
           <w:rPr>
             <w:rStyle w:val="Hyperlink"/>
@@ -343,7 +330,7 @@
             <w:noProof/>
             <w:webHidden/>
           </w:rPr>
-          <w:instrText xml:space="preserve"> PAGEREF _Toc242873691 \h </w:instrText>
+          <w:instrText xml:space="preserve"> PAGEREF _Toc242920569 \h </w:instrText>
         </w:r>
         <w:r>
           <w:rPr>
@@ -381,16 +368,10 @@
           <w:tab w:val="right" w:leader="dot" w:pos="9350"/>
         </w:tabs>
         <w:rPr>
-          <w:rFonts w:asciiTheme="minorHAnsi" w:eastAsiaTheme="minorEastAsia" w:hAnsiTheme="minorHAnsi" w:cstheme="minorBidi"/>
           <w:noProof/>
-          <w:color w:val="auto"/>
-          <w:kern w:val="2"/>
-          <w:szCs w:val="24"/>
-          <w:lang w:val="en-IN" w:eastAsia="en-IN"/>
-          <w14:ligatures w14:val="standardContextual"/>
         </w:rPr>
       </w:pPr>
-      <w:hyperlink w:anchor="_Toc242873692" w:history="1">
+      <w:hyperlink w:anchor="_Toc242920570" w:history="1">
         <w:r>
           <w:rPr>
             <w:rStyle w:val="Hyperlink"/>
@@ -417,7 +398,7 @@
             <w:noProof/>
             <w:webHidden/>
           </w:rPr>
-          <w:instrText xml:space="preserve"> PAGEREF _Toc242873692 \h </w:instrText>
+          <w:instrText xml:space="preserve"> PAGEREF _Toc242920570 \h </w:instrText>
         </w:r>
         <w:r>
           <w:rPr>
@@ -455,16 +436,10 @@
           <w:tab w:val="right" w:leader="dot" w:pos="9350"/>
         </w:tabs>
         <w:rPr>
-          <w:rFonts w:asciiTheme="minorHAnsi" w:eastAsiaTheme="minorEastAsia" w:hAnsiTheme="minorHAnsi" w:cstheme="minorBidi"/>
           <w:noProof/>
-          <w:color w:val="auto"/>
-          <w:kern w:val="2"/>
-          <w:szCs w:val="24"/>
-          <w:lang w:val="en-IN" w:eastAsia="en-IN"/>
-          <w14:ligatures w14:val="standardContextual"/>
         </w:rPr>
       </w:pPr>
-      <w:hyperlink w:anchor="_Toc242873693" w:history="1">
+      <w:hyperlink w:anchor="_Toc242920571" w:history="1">
         <w:r>
           <w:rPr>
             <w:rStyle w:val="Hyperlink"/>
@@ -491,7 +466,7 @@
             <w:noProof/>
             <w:webHidden/>
           </w:rPr>
-          <w:instrText xml:space="preserve"> PAGEREF _Toc242873693 \h </w:instrText>
+          <w:instrText xml:space="preserve"> PAGEREF _Toc242920571 \h </w:instrText>
         </w:r>
         <w:r>
           <w:rPr>
@@ -529,16 +504,10 @@
           <w:tab w:val="right" w:leader="dot" w:pos="9350"/>
         </w:tabs>
         <w:rPr>
-          <w:rFonts w:asciiTheme="minorHAnsi" w:eastAsiaTheme="minorEastAsia" w:hAnsiTheme="minorHAnsi" w:cstheme="minorBidi"/>
           <w:noProof/>
-          <w:color w:val="auto"/>
-          <w:kern w:val="2"/>
-          <w:szCs w:val="24"/>
-          <w:lang w:val="en-IN" w:eastAsia="en-IN"/>
-          <w14:ligatures w14:val="standardContextual"/>
         </w:rPr>
       </w:pPr>
-      <w:hyperlink w:anchor="_Toc242873694" w:history="1">
+      <w:hyperlink w:anchor="_Toc242920572" w:history="1">
         <w:r>
           <w:rPr>
             <w:rStyle w:val="Hyperlink"/>
@@ -565,7 +534,7 @@
             <w:noProof/>
             <w:webHidden/>
           </w:rPr>
-          <w:instrText xml:space="preserve"> PAGEREF _Toc242873694 \h </w:instrText>
+          <w:instrText xml:space="preserve"> PAGEREF _Toc242920572 \h </w:instrText>
         </w:r>
         <w:r>
           <w:rPr>
@@ -603,16 +572,10 @@
           <w:tab w:val="right" w:leader="dot" w:pos="9350"/>
         </w:tabs>
         <w:rPr>
-          <w:rFonts w:asciiTheme="minorHAnsi" w:eastAsiaTheme="minorEastAsia" w:hAnsiTheme="minorHAnsi" w:cstheme="minorBidi"/>
           <w:noProof/>
-          <w:color w:val="auto"/>
-          <w:kern w:val="2"/>
-          <w:szCs w:val="24"/>
-          <w:lang w:val="en-IN" w:eastAsia="en-IN"/>
-          <w14:ligatures w14:val="standardContextual"/>
         </w:rPr>
       </w:pPr>
-      <w:hyperlink w:anchor="_Toc242873695" w:history="1">
+      <w:hyperlink w:anchor="_Toc242920573" w:history="1">
         <w:r>
           <w:rPr>
             <w:rStyle w:val="Hyperlink"/>
@@ -639,7 +602,7 @@
             <w:noProof/>
             <w:webHidden/>
           </w:rPr>
-          <w:instrText xml:space="preserve"> PAGEREF _Toc242873695 \h </w:instrText>
+          <w:instrText xml:space="preserve"> PAGEREF _Toc242920573 \h </w:instrText>
         </w:r>
         <w:r>
           <w:rPr>
@@ -677,16 +640,10 @@
           <w:tab w:val="right" w:leader="dot" w:pos="9350"/>
         </w:tabs>
         <w:rPr>
-          <w:rFonts w:asciiTheme="minorHAnsi" w:eastAsiaTheme="minorEastAsia" w:hAnsiTheme="minorHAnsi" w:cstheme="minorBidi"/>
           <w:noProof/>
-          <w:color w:val="auto"/>
-          <w:kern w:val="2"/>
-          <w:szCs w:val="24"/>
-          <w:lang w:val="en-IN" w:eastAsia="en-IN"/>
-          <w14:ligatures w14:val="standardContextual"/>
         </w:rPr>
       </w:pPr>
-      <w:hyperlink w:anchor="_Toc242873696" w:history="1">
+      <w:hyperlink w:anchor="_Toc242920574" w:history="1">
         <w:r>
           <w:rPr>
             <w:rStyle w:val="Hyperlink"/>
@@ -713,7 +670,7 @@
             <w:noProof/>
             <w:webHidden/>
           </w:rPr>
-          <w:instrText xml:space="preserve"> PAGEREF _Toc242873696 \h </w:instrText>
+          <w:instrText xml:space="preserve"> PAGEREF _Toc242920574 \h </w:instrText>
         </w:r>
         <w:r>
           <w:rPr>
@@ -751,16 +708,10 @@
           <w:tab w:val="right" w:leader="dot" w:pos="9350"/>
         </w:tabs>
         <w:rPr>
-          <w:rFonts w:asciiTheme="minorHAnsi" w:eastAsiaTheme="minorEastAsia" w:hAnsiTheme="minorHAnsi" w:cstheme="minorBidi"/>
           <w:noProof/>
-          <w:color w:val="auto"/>
-          <w:kern w:val="2"/>
-          <w:szCs w:val="24"/>
-          <w:lang w:val="en-IN" w:eastAsia="en-IN"/>
-          <w14:ligatures w14:val="standardContextual"/>
         </w:rPr>
       </w:pPr>
-      <w:hyperlink w:anchor="_Toc242873697" w:history="1">
+      <w:hyperlink w:anchor="_Toc242920575" w:history="1">
         <w:r>
           <w:rPr>
             <w:rStyle w:val="Hyperlink"/>
@@ -787,7 +738,7 @@
             <w:noProof/>
             <w:webHidden/>
           </w:rPr>
-          <w:instrText xml:space="preserve"> PAGEREF _Toc242873697 \h </w:instrText>
+          <w:instrText xml:space="preserve"> PAGEREF _Toc242920575 \h </w:instrText>
         </w:r>
         <w:r>
           <w:rPr>
@@ -825,16 +776,10 @@
           <w:tab w:val="right" w:leader="dot" w:pos="9350"/>
         </w:tabs>
         <w:rPr>
-          <w:rFonts w:asciiTheme="minorHAnsi" w:eastAsiaTheme="minorEastAsia" w:hAnsiTheme="minorHAnsi" w:cstheme="minorBidi"/>
           <w:noProof/>
-          <w:color w:val="auto"/>
-          <w:kern w:val="2"/>
-          <w:szCs w:val="24"/>
-          <w:lang w:val="en-IN" w:eastAsia="en-IN"/>
-          <w14:ligatures w14:val="standardContextual"/>
         </w:rPr>
       </w:pPr>
-      <w:hyperlink w:anchor="_Toc242873698" w:history="1">
+      <w:hyperlink w:anchor="_Toc242920576" w:history="1">
         <w:r>
           <w:rPr>
             <w:rStyle w:val="Hyperlink"/>
@@ -861,7 +806,7 @@
             <w:noProof/>
             <w:webHidden/>
           </w:rPr>
-          <w:instrText xml:space="preserve"> PAGEREF _Toc242873698 \h </w:instrText>
+          <w:instrText xml:space="preserve"> PAGEREF _Toc242920576 \h </w:instrText>
         </w:r>
         <w:r>
           <w:rPr>
@@ -899,16 +844,10 @@
           <w:tab w:val="right" w:leader="dot" w:pos="9350"/>
         </w:tabs>
         <w:rPr>
-          <w:rFonts w:asciiTheme="minorHAnsi" w:eastAsiaTheme="minorEastAsia" w:hAnsiTheme="minorHAnsi" w:cstheme="minorBidi"/>
           <w:noProof/>
-          <w:color w:val="auto"/>
-          <w:kern w:val="2"/>
-          <w:szCs w:val="24"/>
-          <w:lang w:val="en-IN" w:eastAsia="en-IN"/>
-          <w14:ligatures w14:val="standardContextual"/>
         </w:rPr>
       </w:pPr>
-      <w:hyperlink w:anchor="_Toc242873699" w:history="1">
+      <w:hyperlink w:anchor="_Toc242920577" w:history="1">
         <w:r>
           <w:rPr>
             <w:rStyle w:val="Hyperlink"/>
@@ -935,7 +874,7 @@
             <w:noProof/>
             <w:webHidden/>
           </w:rPr>
-          <w:instrText xml:space="preserve"> PAGEREF _Toc242873699 \h </w:instrText>
+          <w:instrText xml:space="preserve"> PAGEREF _Toc242920577 \h </w:instrText>
         </w:r>
         <w:r>
           <w:rPr>
@@ -973,16 +912,10 @@
           <w:tab w:val="right" w:leader="dot" w:pos="9350"/>
         </w:tabs>
         <w:rPr>
-          <w:rFonts w:asciiTheme="minorHAnsi" w:eastAsiaTheme="minorEastAsia" w:hAnsiTheme="minorHAnsi" w:cstheme="minorBidi"/>
           <w:noProof/>
-          <w:color w:val="auto"/>
-          <w:kern w:val="2"/>
-          <w:szCs w:val="24"/>
-          <w:lang w:val="en-IN" w:eastAsia="en-IN"/>
-          <w14:ligatures w14:val="standardContextual"/>
         </w:rPr>
       </w:pPr>
-      <w:hyperlink w:anchor="_Toc242873700" w:history="1">
+      <w:hyperlink w:anchor="_Toc242920578" w:history="1">
         <w:r>
           <w:rPr>
             <w:rStyle w:val="Hyperlink"/>
@@ -1009,7 +942,7 @@
             <w:noProof/>
             <w:webHidden/>
           </w:rPr>
-          <w:instrText xml:space="preserve"> PAGEREF _Toc242873700 \h </w:instrText>
+          <w:instrText xml:space="preserve"> PAGEREF _Toc242920578 \h </w:instrText>
         </w:r>
         <w:r>
           <w:rPr>
@@ -1047,16 +980,10 @@
           <w:tab w:val="right" w:leader="dot" w:pos="9350"/>
         </w:tabs>
         <w:rPr>
-          <w:rFonts w:asciiTheme="minorHAnsi" w:eastAsiaTheme="minorEastAsia" w:hAnsiTheme="minorHAnsi" w:cstheme="minorBidi"/>
           <w:noProof/>
-          <w:color w:val="auto"/>
-          <w:kern w:val="2"/>
-          <w:szCs w:val="24"/>
-          <w:lang w:val="en-IN" w:eastAsia="en-IN"/>
-          <w14:ligatures w14:val="standardContextual"/>
         </w:rPr>
       </w:pPr>
-      <w:hyperlink w:anchor="_Toc242873701" w:history="1">
+      <w:hyperlink w:anchor="_Toc242920579" w:history="1">
         <w:r>
           <w:rPr>
             <w:rStyle w:val="Hyperlink"/>
@@ -1083,7 +1010,7 @@
             <w:noProof/>
             <w:webHidden/>
           </w:rPr>
-          <w:instrText xml:space="preserve"> PAGEREF _Toc242873701 \h </w:instrText>
+          <w:instrText xml:space="preserve"> PAGEREF _Toc242920579 \h </w:instrText>
         </w:r>
         <w:r>
           <w:rPr>
@@ -1121,16 +1048,10 @@
           <w:tab w:val="right" w:leader="dot" w:pos="9350"/>
         </w:tabs>
         <w:rPr>
-          <w:rFonts w:asciiTheme="minorHAnsi" w:eastAsiaTheme="minorEastAsia" w:hAnsiTheme="minorHAnsi" w:cstheme="minorBidi"/>
           <w:noProof/>
-          <w:color w:val="auto"/>
-          <w:kern w:val="2"/>
-          <w:szCs w:val="24"/>
-          <w:lang w:val="en-IN" w:eastAsia="en-IN"/>
-          <w14:ligatures w14:val="standardContextual"/>
         </w:rPr>
       </w:pPr>
-      <w:hyperlink w:anchor="_Toc242873702" w:history="1">
+      <w:hyperlink w:anchor="_Toc242920580" w:history="1">
         <w:r>
           <w:rPr>
             <w:rStyle w:val="Hyperlink"/>
@@ -1157,7 +1078,7 @@
             <w:noProof/>
             <w:webHidden/>
           </w:rPr>
-          <w:instrText xml:space="preserve"> PAGEREF _Toc242873702 \h </w:instrText>
+          <w:instrText xml:space="preserve"> PAGEREF _Toc242920580 \h </w:instrText>
         </w:r>
         <w:r>
           <w:rPr>
@@ -1195,16 +1116,10 @@
           <w:tab w:val="right" w:leader="dot" w:pos="9350"/>
         </w:tabs>
         <w:rPr>
-          <w:rFonts w:asciiTheme="minorHAnsi" w:eastAsiaTheme="minorEastAsia" w:hAnsiTheme="minorHAnsi" w:cstheme="minorBidi"/>
           <w:noProof/>
-          <w:color w:val="auto"/>
-          <w:kern w:val="2"/>
-          <w:szCs w:val="24"/>
-          <w:lang w:val="en-IN" w:eastAsia="en-IN"/>
-          <w14:ligatures w14:val="standardContextual"/>
         </w:rPr>
       </w:pPr>
-      <w:hyperlink w:anchor="_Toc242873703" w:history="1">
+      <w:hyperlink w:anchor="_Toc242920581" w:history="1">
         <w:r>
           <w:rPr>
             <w:rStyle w:val="Hyperlink"/>
@@ -1231,7 +1146,7 @@
             <w:noProof/>
             <w:webHidden/>
           </w:rPr>
-          <w:instrText xml:space="preserve"> PAGEREF _Toc242873703 \h </w:instrText>
+          <w:instrText xml:space="preserve"> PAGEREF _Toc242920581 \h </w:instrText>
         </w:r>
         <w:r>
           <w:rPr>
@@ -1269,16 +1184,10 @@
           <w:tab w:val="right" w:leader="dot" w:pos="9350"/>
         </w:tabs>
         <w:rPr>
-          <w:rFonts w:asciiTheme="minorHAnsi" w:eastAsiaTheme="minorEastAsia" w:hAnsiTheme="minorHAnsi" w:cstheme="minorBidi"/>
           <w:noProof/>
-          <w:color w:val="auto"/>
-          <w:kern w:val="2"/>
-          <w:szCs w:val="24"/>
-          <w:lang w:val="en-IN" w:eastAsia="en-IN"/>
-          <w14:ligatures w14:val="standardContextual"/>
         </w:rPr>
       </w:pPr>
-      <w:hyperlink w:anchor="_Toc242873704" w:history="1">
+      <w:hyperlink w:anchor="_Toc242920582" w:history="1">
         <w:r>
           <w:rPr>
             <w:rStyle w:val="Hyperlink"/>
@@ -1305,7 +1214,7 @@
             <w:noProof/>
             <w:webHidden/>
           </w:rPr>
-          <w:instrText xml:space="preserve"> PAGEREF _Toc242873704 \h </w:instrText>
+          <w:instrText xml:space="preserve"> PAGEREF _Toc242920582 \h </w:instrText>
         </w:r>
         <w:r>
           <w:rPr>
@@ -1343,16 +1252,10 @@
           <w:tab w:val="right" w:leader="dot" w:pos="9350"/>
         </w:tabs>
         <w:rPr>
-          <w:rFonts w:asciiTheme="minorHAnsi" w:eastAsiaTheme="minorEastAsia" w:hAnsiTheme="minorHAnsi" w:cstheme="minorBidi"/>
           <w:noProof/>
-          <w:color w:val="auto"/>
-          <w:kern w:val="2"/>
-          <w:szCs w:val="24"/>
-          <w:lang w:val="en-IN" w:eastAsia="en-IN"/>
-          <w14:ligatures w14:val="standardContextual"/>
         </w:rPr>
       </w:pPr>
-      <w:hyperlink w:anchor="_Toc242873705" w:history="1">
+      <w:hyperlink w:anchor="_Toc242920583" w:history="1">
         <w:r>
           <w:rPr>
             <w:rStyle w:val="Hyperlink"/>
@@ -1379,7 +1282,7 @@
             <w:noProof/>
             <w:webHidden/>
           </w:rPr>
-          <w:instrText xml:space="preserve"> PAGEREF _Toc242873705 \h </w:instrText>
+          <w:instrText xml:space="preserve"> PAGEREF _Toc242920583 \h </w:instrText>
         </w:r>
         <w:r>
           <w:rPr>
@@ -1417,16 +1320,10 @@
           <w:tab w:val="right" w:leader="dot" w:pos="9350"/>
         </w:tabs>
         <w:rPr>
-          <w:rFonts w:asciiTheme="minorHAnsi" w:eastAsiaTheme="minorEastAsia" w:hAnsiTheme="minorHAnsi" w:cstheme="minorBidi"/>
           <w:noProof/>
-          <w:color w:val="auto"/>
-          <w:kern w:val="2"/>
-          <w:szCs w:val="24"/>
-          <w:lang w:val="en-IN" w:eastAsia="en-IN"/>
-          <w14:ligatures w14:val="standardContextual"/>
         </w:rPr>
       </w:pPr>
-      <w:hyperlink w:anchor="_Toc242873706" w:history="1">
+      <w:hyperlink w:anchor="_Toc242920584" w:history="1">
         <w:r>
           <w:rPr>
             <w:rStyle w:val="Hyperlink"/>
@@ -1453,7 +1350,7 @@
             <w:noProof/>
             <w:webHidden/>
           </w:rPr>
-          <w:instrText xml:space="preserve"> PAGEREF _Toc242873706 \h </w:instrText>
+          <w:instrText xml:space="preserve"> PAGEREF _Toc242920584 \h </w:instrText>
         </w:r>
         <w:r>
           <w:rPr>
@@ -1491,16 +1388,10 @@
           <w:tab w:val="right" w:leader="dot" w:pos="9350"/>
         </w:tabs>
         <w:rPr>
-          <w:rFonts w:asciiTheme="minorHAnsi" w:eastAsiaTheme="minorEastAsia" w:hAnsiTheme="minorHAnsi" w:cstheme="minorBidi"/>
           <w:noProof/>
-          <w:color w:val="auto"/>
-          <w:kern w:val="2"/>
-          <w:szCs w:val="24"/>
-          <w:lang w:val="en-IN" w:eastAsia="en-IN"/>
-          <w14:ligatures w14:val="standardContextual"/>
         </w:rPr>
       </w:pPr>
-      <w:hyperlink w:anchor="_Toc242873707" w:history="1">
+      <w:hyperlink w:anchor="_Toc242920585" w:history="1">
         <w:r>
           <w:rPr>
             <w:rStyle w:val="Hyperlink"/>
@@ -1527,7 +1418,7 @@
             <w:noProof/>
             <w:webHidden/>
           </w:rPr>
-          <w:instrText xml:space="preserve"> PAGEREF _Toc242873707 \h </w:instrText>
+          <w:instrText xml:space="preserve"> PAGEREF _Toc242920585 \h </w:instrText>
         </w:r>
         <w:r>
           <w:rPr>
@@ -1565,16 +1456,10 @@
           <w:tab w:val="right" w:leader="dot" w:pos="9350"/>
         </w:tabs>
         <w:rPr>
-          <w:rFonts w:asciiTheme="minorHAnsi" w:eastAsiaTheme="minorEastAsia" w:hAnsiTheme="minorHAnsi" w:cstheme="minorBidi"/>
           <w:noProof/>
-          <w:color w:val="auto"/>
-          <w:kern w:val="2"/>
-          <w:szCs w:val="24"/>
-          <w:lang w:val="en-IN" w:eastAsia="en-IN"/>
-          <w14:ligatures w14:val="standardContextual"/>
         </w:rPr>
       </w:pPr>
-      <w:hyperlink w:anchor="_Toc242873708" w:history="1">
+      <w:hyperlink w:anchor="_Toc242920586" w:history="1">
         <w:r>
           <w:rPr>
             <w:rStyle w:val="Hyperlink"/>
@@ -1601,7 +1486,7 @@
             <w:noProof/>
             <w:webHidden/>
           </w:rPr>
-          <w:instrText xml:space="preserve"> PAGEREF _Toc242873708 \h </w:instrText>
+          <w:instrText xml:space="preserve"> PAGEREF _Toc242920586 \h </w:instrText>
         </w:r>
         <w:r>
           <w:rPr>
@@ -1639,16 +1524,10 @@
           <w:tab w:val="right" w:leader="dot" w:pos="9350"/>
         </w:tabs>
         <w:rPr>
-          <w:rFonts w:asciiTheme="minorHAnsi" w:eastAsiaTheme="minorEastAsia" w:hAnsiTheme="minorHAnsi" w:cstheme="minorBidi"/>
           <w:noProof/>
-          <w:color w:val="auto"/>
-          <w:kern w:val="2"/>
-          <w:szCs w:val="24"/>
-          <w:lang w:val="en-IN" w:eastAsia="en-IN"/>
-          <w14:ligatures w14:val="standardContextual"/>
         </w:rPr>
       </w:pPr>
-      <w:hyperlink w:anchor="_Toc242873709" w:history="1">
+      <w:hyperlink w:anchor="_Toc242920587" w:history="1">
         <w:r>
           <w:rPr>
             <w:rStyle w:val="Hyperlink"/>
@@ -1675,7 +1554,7 @@
             <w:noProof/>
             <w:webHidden/>
           </w:rPr>
-          <w:instrText xml:space="preserve"> PAGEREF _Toc242873709 \h </w:instrText>
+          <w:instrText xml:space="preserve"> PAGEREF _Toc242920587 \h </w:instrText>
         </w:r>
         <w:r>
           <w:rPr>
@@ -1713,16 +1592,10 @@
           <w:tab w:val="right" w:leader="dot" w:pos="9350"/>
         </w:tabs>
         <w:rPr>
-          <w:rFonts w:asciiTheme="minorHAnsi" w:eastAsiaTheme="minorEastAsia" w:hAnsiTheme="minorHAnsi" w:cstheme="minorBidi"/>
           <w:noProof/>
-          <w:color w:val="auto"/>
-          <w:kern w:val="2"/>
-          <w:szCs w:val="24"/>
-          <w:lang w:val="en-IN" w:eastAsia="en-IN"/>
-          <w14:ligatures w14:val="standardContextual"/>
         </w:rPr>
       </w:pPr>
-      <w:hyperlink w:anchor="_Toc242873710" w:history="1">
+      <w:hyperlink w:anchor="_Toc242920588" w:history="1">
         <w:r>
           <w:rPr>
             <w:rStyle w:val="Hyperlink"/>
@@ -1749,7 +1622,7 @@
             <w:noProof/>
             <w:webHidden/>
           </w:rPr>
-          <w:instrText xml:space="preserve"> PAGEREF _Toc242873710 \h </w:instrText>
+          <w:instrText xml:space="preserve"> PAGEREF _Toc242920588 \h </w:instrText>
         </w:r>
         <w:r>
           <w:rPr>
@@ -1787,16 +1660,10 @@
           <w:tab w:val="right" w:leader="dot" w:pos="9350"/>
         </w:tabs>
         <w:rPr>
-          <w:rFonts w:asciiTheme="minorHAnsi" w:eastAsiaTheme="minorEastAsia" w:hAnsiTheme="minorHAnsi" w:cstheme="minorBidi"/>
           <w:noProof/>
-          <w:color w:val="auto"/>
-          <w:kern w:val="2"/>
-          <w:szCs w:val="24"/>
-          <w:lang w:val="en-IN" w:eastAsia="en-IN"/>
-          <w14:ligatures w14:val="standardContextual"/>
         </w:rPr>
       </w:pPr>
-      <w:hyperlink w:anchor="_Toc242873711" w:history="1">
+      <w:hyperlink w:anchor="_Toc242920589" w:history="1">
         <w:r>
           <w:rPr>
             <w:rStyle w:val="Hyperlink"/>
@@ -1823,7 +1690,7 @@
             <w:noProof/>
             <w:webHidden/>
           </w:rPr>
-          <w:instrText xml:space="preserve"> PAGEREF _Toc242873711 \h </w:instrText>
+          <w:instrText xml:space="preserve"> PAGEREF _Toc242920589 \h </w:instrText>
         </w:r>
         <w:r>
           <w:rPr>
@@ -1861,16 +1728,10 @@
           <w:tab w:val="right" w:leader="dot" w:pos="9350"/>
         </w:tabs>
         <w:rPr>
-          <w:rFonts w:asciiTheme="minorHAnsi" w:eastAsiaTheme="minorEastAsia" w:hAnsiTheme="minorHAnsi" w:cstheme="minorBidi"/>
           <w:noProof/>
-          <w:color w:val="auto"/>
-          <w:kern w:val="2"/>
-          <w:szCs w:val="24"/>
-          <w:lang w:val="en-IN" w:eastAsia="en-IN"/>
-          <w14:ligatures w14:val="standardContextual"/>
         </w:rPr>
       </w:pPr>
-      <w:hyperlink w:anchor="_Toc242873712" w:history="1">
+      <w:hyperlink w:anchor="_Toc242920590" w:history="1">
         <w:r>
           <w:rPr>
             <w:rStyle w:val="Hyperlink"/>
@@ -1897,7 +1758,7 @@
             <w:noProof/>
             <w:webHidden/>
           </w:rPr>
-          <w:instrText xml:space="preserve"> PAGEREF _Toc242873712 \h </w:instrText>
+          <w:instrText xml:space="preserve"> PAGEREF _Toc242920590 \h </w:instrText>
         </w:r>
         <w:r>
           <w:rPr>
@@ -1935,16 +1796,10 @@
           <w:tab w:val="right" w:leader="dot" w:pos="9350"/>
         </w:tabs>
         <w:rPr>
-          <w:rFonts w:asciiTheme="minorHAnsi" w:eastAsiaTheme="minorEastAsia" w:hAnsiTheme="minorHAnsi" w:cstheme="minorBidi"/>
           <w:noProof/>
-          <w:color w:val="auto"/>
-          <w:kern w:val="2"/>
-          <w:szCs w:val="24"/>
-          <w:lang w:val="en-IN" w:eastAsia="en-IN"/>
-          <w14:ligatures w14:val="standardContextual"/>
         </w:rPr>
       </w:pPr>
-      <w:hyperlink w:anchor="_Toc242873713" w:history="1">
+      <w:hyperlink w:anchor="_Toc242920591" w:history="1">
         <w:r>
           <w:rPr>
             <w:rStyle w:val="Hyperlink"/>
@@ -1971,7 +1826,7 @@
             <w:noProof/>
             <w:webHidden/>
           </w:rPr>
-          <w:instrText xml:space="preserve"> PAGEREF _Toc242873713 \h </w:instrText>
+          <w:instrText xml:space="preserve"> PAGEREF _Toc242920591 \h </w:instrText>
         </w:r>
         <w:r>
           <w:rPr>
@@ -2009,16 +1864,10 @@
           <w:tab w:val="right" w:leader="dot" w:pos="9350"/>
         </w:tabs>
         <w:rPr>
-          <w:rFonts w:asciiTheme="minorHAnsi" w:eastAsiaTheme="minorEastAsia" w:hAnsiTheme="minorHAnsi" w:cstheme="minorBidi"/>
           <w:noProof/>
-          <w:color w:val="auto"/>
-          <w:kern w:val="2"/>
-          <w:szCs w:val="24"/>
-          <w:lang w:val="en-IN" w:eastAsia="en-IN"/>
-          <w14:ligatures w14:val="standardContextual"/>
         </w:rPr>
       </w:pPr>
-      <w:hyperlink w:anchor="_Toc242873714" w:history="1">
+      <w:hyperlink w:anchor="_Toc242920592" w:history="1">
         <w:r>
           <w:rPr>
             <w:rStyle w:val="Hyperlink"/>
@@ -2045,7 +1894,7 @@
             <w:noProof/>
             <w:webHidden/>
           </w:rPr>
-          <w:instrText xml:space="preserve"> PAGEREF _Toc242873714 \h </w:instrText>
+          <w:instrText xml:space="preserve"> PAGEREF _Toc242920592 \h </w:instrText>
         </w:r>
         <w:r>
           <w:rPr>
@@ -2083,16 +1932,10 @@
           <w:tab w:val="right" w:leader="dot" w:pos="9350"/>
         </w:tabs>
         <w:rPr>
-          <w:rFonts w:asciiTheme="minorHAnsi" w:eastAsiaTheme="minorEastAsia" w:hAnsiTheme="minorHAnsi" w:cstheme="minorBidi"/>
           <w:noProof/>
-          <w:color w:val="auto"/>
-          <w:kern w:val="2"/>
-          <w:szCs w:val="24"/>
-          <w:lang w:val="en-IN" w:eastAsia="en-IN"/>
-          <w14:ligatures w14:val="standardContextual"/>
         </w:rPr>
       </w:pPr>
-      <w:hyperlink w:anchor="_Toc242873715" w:history="1">
+      <w:hyperlink w:anchor="_Toc242920593" w:history="1">
         <w:r>
           <w:rPr>
             <w:rStyle w:val="Hyperlink"/>
@@ -2119,7 +1962,7 @@
             <w:noProof/>
             <w:webHidden/>
           </w:rPr>
-          <w:instrText xml:space="preserve"> PAGEREF _Toc242873715 \h </w:instrText>
+          <w:instrText xml:space="preserve"> PAGEREF _Toc242920593 \h </w:instrText>
         </w:r>
         <w:r>
           <w:rPr>
@@ -2157,16 +2000,10 @@
           <w:tab w:val="right" w:leader="dot" w:pos="9350"/>
         </w:tabs>
         <w:rPr>
-          <w:rFonts w:asciiTheme="minorHAnsi" w:eastAsiaTheme="minorEastAsia" w:hAnsiTheme="minorHAnsi" w:cstheme="minorBidi"/>
           <w:noProof/>
-          <w:color w:val="auto"/>
-          <w:kern w:val="2"/>
-          <w:szCs w:val="24"/>
-          <w:lang w:val="en-IN" w:eastAsia="en-IN"/>
-          <w14:ligatures w14:val="standardContextual"/>
         </w:rPr>
       </w:pPr>
-      <w:hyperlink w:anchor="_Toc242873716" w:history="1">
+      <w:hyperlink w:anchor="_Toc242920594" w:history="1">
         <w:r>
           <w:rPr>
             <w:rStyle w:val="Hyperlink"/>
@@ -2193,7 +2030,7 @@
             <w:noProof/>
             <w:webHidden/>
           </w:rPr>
-          <w:instrText xml:space="preserve"> PAGEREF _Toc242873716 \h </w:instrText>
+          <w:instrText xml:space="preserve"> PAGEREF _Toc242920594 \h </w:instrText>
         </w:r>
         <w:r>
           <w:rPr>
@@ -2231,16 +2068,10 @@
           <w:tab w:val="right" w:leader="dot" w:pos="9350"/>
         </w:tabs>
         <w:rPr>
-          <w:rFonts w:asciiTheme="minorHAnsi" w:eastAsiaTheme="minorEastAsia" w:hAnsiTheme="minorHAnsi" w:cstheme="minorBidi"/>
           <w:noProof/>
-          <w:color w:val="auto"/>
-          <w:kern w:val="2"/>
-          <w:szCs w:val="24"/>
-          <w:lang w:val="en-IN" w:eastAsia="en-IN"/>
-          <w14:ligatures w14:val="standardContextual"/>
         </w:rPr>
       </w:pPr>
-      <w:hyperlink w:anchor="_Toc242873717" w:history="1">
+      <w:hyperlink w:anchor="_Toc242920595" w:history="1">
         <w:r>
           <w:rPr>
             <w:rStyle w:val="Hyperlink"/>
@@ -2267,7 +2098,7 @@
             <w:noProof/>
             <w:webHidden/>
           </w:rPr>
-          <w:instrText xml:space="preserve"> PAGEREF _Toc242873717 \h </w:instrText>
+          <w:instrText xml:space="preserve"> PAGEREF _Toc242920595 \h </w:instrText>
         </w:r>
         <w:r>
           <w:rPr>
@@ -2305,16 +2136,10 @@
           <w:tab w:val="right" w:leader="dot" w:pos="9350"/>
         </w:tabs>
         <w:rPr>
-          <w:rFonts w:asciiTheme="minorHAnsi" w:eastAsiaTheme="minorEastAsia" w:hAnsiTheme="minorHAnsi" w:cstheme="minorBidi"/>
           <w:noProof/>
-          <w:color w:val="auto"/>
-          <w:kern w:val="2"/>
-          <w:szCs w:val="24"/>
-          <w:lang w:val="en-IN" w:eastAsia="en-IN"/>
-          <w14:ligatures w14:val="standardContextual"/>
         </w:rPr>
       </w:pPr>
-      <w:hyperlink w:anchor="_Toc242873718" w:history="1">
+      <w:hyperlink w:anchor="_Toc242920596" w:history="1">
         <w:r>
           <w:rPr>
             <w:rStyle w:val="Hyperlink"/>
@@ -2341,7 +2166,7 @@
             <w:noProof/>
             <w:webHidden/>
           </w:rPr>
-          <w:instrText xml:space="preserve"> PAGEREF _Toc242873718 \h </w:instrText>
+          <w:instrText xml:space="preserve"> PAGEREF _Toc242920596 \h </w:instrText>
         </w:r>
         <w:r>
           <w:rPr>
@@ -2379,16 +2204,10 @@
           <w:tab w:val="right" w:leader="dot" w:pos="9350"/>
         </w:tabs>
         <w:rPr>
-          <w:rFonts w:asciiTheme="minorHAnsi" w:eastAsiaTheme="minorEastAsia" w:hAnsiTheme="minorHAnsi" w:cstheme="minorBidi"/>
           <w:noProof/>
-          <w:color w:val="auto"/>
-          <w:kern w:val="2"/>
-          <w:szCs w:val="24"/>
-          <w:lang w:val="en-IN" w:eastAsia="en-IN"/>
-          <w14:ligatures w14:val="standardContextual"/>
         </w:rPr>
       </w:pPr>
-      <w:hyperlink w:anchor="_Toc242873719" w:history="1">
+      <w:hyperlink w:anchor="_Toc242920597" w:history="1">
         <w:r>
           <w:rPr>
             <w:rStyle w:val="Hyperlink"/>
@@ -2415,7 +2234,7 @@
             <w:noProof/>
             <w:webHidden/>
           </w:rPr>
-          <w:instrText xml:space="preserve"> PAGEREF _Toc242873719 \h </w:instrText>
+          <w:instrText xml:space="preserve"> PAGEREF _Toc242920597 \h </w:instrText>
         </w:r>
         <w:r>
           <w:rPr>
@@ -2453,16 +2272,10 @@
           <w:tab w:val="right" w:leader="dot" w:pos="9350"/>
         </w:tabs>
         <w:rPr>
-          <w:rFonts w:asciiTheme="minorHAnsi" w:eastAsiaTheme="minorEastAsia" w:hAnsiTheme="minorHAnsi" w:cstheme="minorBidi"/>
           <w:noProof/>
-          <w:color w:val="auto"/>
-          <w:kern w:val="2"/>
-          <w:szCs w:val="24"/>
-          <w:lang w:val="en-IN" w:eastAsia="en-IN"/>
-          <w14:ligatures w14:val="standardContextual"/>
         </w:rPr>
       </w:pPr>
-      <w:hyperlink w:anchor="_Toc242873720" w:history="1">
+      <w:hyperlink w:anchor="_Toc242920598" w:history="1">
         <w:r>
           <w:rPr>
             <w:rStyle w:val="Hyperlink"/>
@@ -2489,7 +2302,7 @@
             <w:noProof/>
             <w:webHidden/>
           </w:rPr>
-          <w:instrText xml:space="preserve"> PAGEREF _Toc242873720 \h </w:instrText>
+          <w:instrText xml:space="preserve"> PAGEREF _Toc242920598 \h </w:instrText>
         </w:r>
         <w:r>
           <w:rPr>
@@ -2527,16 +2340,10 @@
           <w:tab w:val="right" w:leader="dot" w:pos="9350"/>
         </w:tabs>
         <w:rPr>
-          <w:rFonts w:asciiTheme="minorHAnsi" w:eastAsiaTheme="minorEastAsia" w:hAnsiTheme="minorHAnsi" w:cstheme="minorBidi"/>
           <w:noProof/>
-          <w:color w:val="auto"/>
-          <w:kern w:val="2"/>
-          <w:szCs w:val="24"/>
-          <w:lang w:val="en-IN" w:eastAsia="en-IN"/>
-          <w14:ligatures w14:val="standardContextual"/>
         </w:rPr>
       </w:pPr>
-      <w:hyperlink w:anchor="_Toc242873721" w:history="1">
+      <w:hyperlink w:anchor="_Toc242920599" w:history="1">
         <w:r>
           <w:rPr>
             <w:rStyle w:val="Hyperlink"/>
@@ -2563,7 +2370,7 @@
             <w:noProof/>
             <w:webHidden/>
           </w:rPr>
-          <w:instrText xml:space="preserve"> PAGEREF _Toc242873721 \h </w:instrText>
+          <w:instrText xml:space="preserve"> PAGEREF _Toc242920599 \h </w:instrText>
         </w:r>
         <w:r>
           <w:rPr>
@@ -2601,16 +2408,10 @@
           <w:tab w:val="right" w:leader="dot" w:pos="9350"/>
         </w:tabs>
         <w:rPr>
-          <w:rFonts w:asciiTheme="minorHAnsi" w:eastAsiaTheme="minorEastAsia" w:hAnsiTheme="minorHAnsi" w:cstheme="minorBidi"/>
           <w:noProof/>
-          <w:color w:val="auto"/>
-          <w:kern w:val="2"/>
-          <w:szCs w:val="24"/>
-          <w:lang w:val="en-IN" w:eastAsia="en-IN"/>
-          <w14:ligatures w14:val="standardContextual"/>
         </w:rPr>
       </w:pPr>
-      <w:hyperlink w:anchor="_Toc242873722" w:history="1">
+      <w:hyperlink w:anchor="_Toc242920600" w:history="1">
         <w:r>
           <w:rPr>
             <w:rStyle w:val="Hyperlink"/>
@@ -2637,7 +2438,7 @@
             <w:noProof/>
             <w:webHidden/>
           </w:rPr>
-          <w:instrText xml:space="preserve"> PAGEREF _Toc242873722 \h </w:instrText>
+          <w:instrText xml:space="preserve"> PAGEREF _Toc242920600 \h </w:instrText>
         </w:r>
         <w:r>
           <w:rPr>
@@ -2675,16 +2476,10 @@
           <w:tab w:val="right" w:leader="dot" w:pos="9350"/>
         </w:tabs>
         <w:rPr>
-          <w:rFonts w:asciiTheme="minorHAnsi" w:eastAsiaTheme="minorEastAsia" w:hAnsiTheme="minorHAnsi" w:cstheme="minorBidi"/>
           <w:noProof/>
-          <w:color w:val="auto"/>
-          <w:kern w:val="2"/>
-          <w:szCs w:val="24"/>
-          <w:lang w:val="en-IN" w:eastAsia="en-IN"/>
-          <w14:ligatures w14:val="standardContextual"/>
         </w:rPr>
       </w:pPr>
-      <w:hyperlink w:anchor="_Toc242873723" w:history="1">
+      <w:hyperlink w:anchor="_Toc242920601" w:history="1">
         <w:r>
           <w:rPr>
             <w:rStyle w:val="Hyperlink"/>
@@ -2711,7 +2506,7 @@
             <w:noProof/>
             <w:webHidden/>
           </w:rPr>
-          <w:instrText xml:space="preserve"> PAGEREF _Toc242873723 \h </w:instrText>
+          <w:instrText xml:space="preserve"> PAGEREF _Toc242920601 \h </w:instrText>
         </w:r>
         <w:r>
           <w:rPr>
@@ -2749,16 +2544,10 @@
           <w:tab w:val="right" w:leader="dot" w:pos="9350"/>
         </w:tabs>
         <w:rPr>
-          <w:rFonts w:asciiTheme="minorHAnsi" w:eastAsiaTheme="minorEastAsia" w:hAnsiTheme="minorHAnsi" w:cstheme="minorBidi"/>
           <w:noProof/>
-          <w:color w:val="auto"/>
-          <w:kern w:val="2"/>
-          <w:szCs w:val="24"/>
-          <w:lang w:val="en-IN" w:eastAsia="en-IN"/>
-          <w14:ligatures w14:val="standardContextual"/>
         </w:rPr>
       </w:pPr>
-      <w:hyperlink w:anchor="_Toc242873724" w:history="1">
+      <w:hyperlink w:anchor="_Toc242920602" w:history="1">
         <w:r>
           <w:rPr>
             <w:rStyle w:val="Hyperlink"/>
@@ -2785,7 +2574,7 @@
             <w:noProof/>
             <w:webHidden/>
           </w:rPr>
-          <w:instrText xml:space="preserve"> PAGEREF _Toc242873724 \h </w:instrText>
+          <w:instrText xml:space="preserve"> PAGEREF _Toc242920602 \h </w:instrText>
         </w:r>
         <w:r>
           <w:rPr>
@@ -2833,12 +2622,11 @@
       <w:pPr>
         <w:pStyle w:val="Heading1"/>
       </w:pPr>
-      <w:bookmarkStart w:id="1" w:name="_Toc242873691"/>
+      <w:bookmarkStart w:id="1" w:name="_Toc242920569"/>
       <w:r>
         <w:rPr>
           <w:rFonts w:ascii="Times New Roman" w:hAnsi="Times New Roman" w:cs="Times New Roman"/>
         </w:rPr>
-        <w:lastRenderedPageBreak/>
         <w:t>1. Introduction</w:t>
       </w:r>
       <w:bookmarkEnd w:id="1"/>
@@ -2847,7 +2635,7 @@
       <w:pPr>
         <w:pStyle w:val="Heading2"/>
       </w:pPr>
-      <w:bookmarkStart w:id="2" w:name="_Toc242873692"/>
+      <w:bookmarkStart w:id="2" w:name="_Toc242920570"/>
       <w:r>
         <w:rPr>
           <w:rFonts w:ascii="Times New Roman" w:hAnsi="Times New Roman" w:cs="Times New Roman"/>
@@ -2882,7 +2670,7 @@
       <w:pPr>
         <w:pStyle w:val="Heading2"/>
       </w:pPr>
-      <w:bookmarkStart w:id="3" w:name="_Toc242873693"/>
+      <w:bookmarkStart w:id="3" w:name="_Toc242920571"/>
       <w:r>
         <w:rPr>
           <w:rFonts w:ascii="Times New Roman" w:hAnsi="Times New Roman" w:cs="Times New Roman"/>
@@ -2941,7 +2729,6 @@
         <w:jc w:val="both"/>
       </w:pPr>
       <w:r>
-        <w:lastRenderedPageBreak/>
         <w:t>and since cos(q, d) is non-negative on unit vectors, squaring preserves order. Every document keeps its rank. Section 3.3 gives the measured version of this statement and Section 3.4 gives a construction that escapes it.</w:t>
       </w:r>
     </w:p>
@@ -2949,7 +2736,7 @@
       <w:pPr>
         <w:pStyle w:val="Heading2"/>
       </w:pPr>
-      <w:bookmarkStart w:id="4" w:name="_Toc242873694"/>
+      <w:bookmarkStart w:id="4" w:name="_Toc242920572"/>
       <w:r>
         <w:rPr>
           <w:rFonts w:ascii="Times New Roman" w:hAnsi="Times New Roman" w:cs="Times New Roman"/>
@@ -3026,7 +2813,7 @@
       <w:pPr>
         <w:pStyle w:val="Heading2"/>
       </w:pPr>
-      <w:bookmarkStart w:id="5" w:name="_Toc242873695"/>
+      <w:bookmarkStart w:id="5" w:name="_Toc242920573"/>
       <w:r>
         <w:rPr>
           <w:rFonts w:ascii="Times New Roman" w:hAnsi="Times New Roman" w:cs="Times New Roman"/>
@@ -3047,7 +2834,7 @@
       <w:pPr>
         <w:pStyle w:val="Heading1"/>
       </w:pPr>
-      <w:bookmarkStart w:id="6" w:name="_Toc242873696"/>
+      <w:bookmarkStart w:id="6" w:name="_Toc242920574"/>
       <w:r>
         <w:rPr>
           <w:rFonts w:ascii="Times New Roman" w:hAnsi="Times New Roman" w:cs="Times New Roman"/>
@@ -3075,11 +2862,7 @@
         <w:t>Rank-equivalence and quantum kernels.</w:t>
       </w:r>
       <w:r>
-        <w:t xml:space="preserve"> That a quantum model's decision function can be written as a kernel method is now standard (Schuld, 2021; Schuld and Killoran, 2019), and </w:t>
-      </w:r>
-      <w:r>
-        <w:lastRenderedPageBreak/>
-        <w:t>fidelity kernels of the form |⟨φ(x)|φ(x')⟩|² are the canonical construction (Havlicek et al., 2019). The conditions under which such a kernel can offer an advantage are restrictive: separations are known for contrived, cryptographically structured data (Liu, Arunachalam and Temme, 2021), while for data-driven problems classical methods with access to the same data are of</w:t>
+        <w:t xml:space="preserve"> That a quantum model's decision function can be written as a kernel method is now standard (Schuld, 2021; Schuld and Killoran, 2019), and fidelity kernels of the form |⟨φ(x)|φ(x')⟩|² are the canonical construction (Havlicek et al., 2019). The conditions under which such a kernel can offer an advantage are restrictive: separations are known for contrived, cryptographically structured data (Liu, Arunachalam and Temme, 2021), while for data-driven problems classical methods with access to the same data are of</w:t>
       </w:r>
       <w:r>
         <w:t>ten competitive (Huang et al., 2021), and several proposed quantum advantages in recommendation and linear algebra were subsequently dequantised (Tang, 2019; see also Aaronson, 2015, on the fine print of such claims). The quantum language model and complex-valued matching literature (Sordoni, Nie and Bengio, 2013; Zhang et al., 2018; Li, Wang and Melucci, 2019; Wang et al., 2019) is where phase is argued to carry retrieval-relevant information; our construction takes that argument seriously and tests the we</w:t>
@@ -3148,12 +2931,11 @@
       <w:pPr>
         <w:pStyle w:val="Heading1"/>
       </w:pPr>
-      <w:bookmarkStart w:id="7" w:name="_Toc242873697"/>
+      <w:bookmarkStart w:id="7" w:name="_Toc242920575"/>
       <w:r>
         <w:rPr>
           <w:rFonts w:ascii="Times New Roman" w:hAnsi="Times New Roman" w:cs="Times New Roman"/>
         </w:rPr>
-        <w:lastRenderedPageBreak/>
         <w:t>3. Method</w:t>
       </w:r>
       <w:bookmarkEnd w:id="7"/>
@@ -3162,7 +2944,7 @@
       <w:pPr>
         <w:pStyle w:val="Heading2"/>
       </w:pPr>
-      <w:bookmarkStart w:id="8" w:name="_Toc242873698"/>
+      <w:bookmarkStart w:id="8" w:name="_Toc242920576"/>
       <w:r>
         <w:rPr>
           <w:rFonts w:ascii="Times New Roman" w:hAnsi="Times New Roman" w:cs="Times New Roman"/>
@@ -3543,7 +3325,7 @@
       <w:pPr>
         <w:pStyle w:val="Heading2"/>
       </w:pPr>
-      <w:bookmarkStart w:id="9" w:name="_Toc242873699"/>
+      <w:bookmarkStart w:id="9" w:name="_Toc242920577"/>
       <w:r>
         <w:rPr>
           <w:rFonts w:ascii="Times New Roman" w:hAnsi="Times New Roman" w:cs="Times New Roman"/>
@@ -3581,12 +3363,11 @@
       <w:pPr>
         <w:pStyle w:val="Heading2"/>
       </w:pPr>
-      <w:bookmarkStart w:id="10" w:name="_Toc242873700"/>
+      <w:bookmarkStart w:id="10" w:name="_Toc242920578"/>
       <w:r>
         <w:rPr>
           <w:rFonts w:ascii="Times New Roman" w:hAnsi="Times New Roman" w:cs="Times New Roman"/>
         </w:rPr>
-        <w:lastRenderedPageBreak/>
         <w:t>3.3 The rank-equivalence problem, measured</w:t>
       </w:r>
       <w:bookmarkEnd w:id="10"/>
@@ -3646,7 +3427,7 @@
       <w:pPr>
         <w:pStyle w:val="Heading2"/>
       </w:pPr>
-      <w:bookmarkStart w:id="11" w:name="_Toc242873701"/>
+      <w:bookmarkStart w:id="11" w:name="_Toc242920579"/>
       <w:r>
         <w:rPr>
           <w:rFonts w:ascii="Times New Roman" w:hAnsi="Times New Roman" w:cs="Times New Roman"/>
@@ -3692,7 +3473,7 @@
       <w:pPr>
         <w:pStyle w:val="Heading2"/>
       </w:pPr>
-      <w:bookmarkStart w:id="12" w:name="_Toc242873702"/>
+      <w:bookmarkStart w:id="12" w:name="_Toc242920580"/>
       <w:r>
         <w:rPr>
           <w:rFonts w:ascii="Times New Roman" w:hAnsi="Times New Roman" w:cs="Times New Roman"/>
@@ -3714,7 +3495,6 @@
         <w:jc w:val="both"/>
       </w:pPr>
       <w:r>
-        <w:lastRenderedPageBreak/>
         <w:t xml:space="preserve">Two criteria were fixed </w:t>
       </w:r>
       <w:r>
@@ -3919,7 +3699,7 @@
       <w:pPr>
         <w:pStyle w:val="Heading2"/>
       </w:pPr>
-      <w:bookmarkStart w:id="13" w:name="_Toc242873703"/>
+      <w:bookmarkStart w:id="13" w:name="_Toc242920581"/>
       <w:r>
         <w:rPr>
           <w:rFonts w:ascii="Times New Roman" w:hAnsi="Times New Roman" w:cs="Times New Roman"/>
@@ -3951,7 +3731,7 @@
       <w:pPr>
         <w:pStyle w:val="Heading2"/>
       </w:pPr>
-      <w:bookmarkStart w:id="14" w:name="_Toc242873704"/>
+      <w:bookmarkStart w:id="14" w:name="_Toc242920582"/>
       <w:r>
         <w:rPr>
           <w:rFonts w:ascii="Times New Roman" w:hAnsi="Times New Roman" w:cs="Times New Roman"/>
@@ -3999,7 +3779,6 @@
         <w:jc w:val="both"/>
       </w:pPr>
       <w:r>
-        <w:lastRenderedPageBreak/>
         <w:t xml:space="preserve">with r_i the fused relevance of candidate </w:t>
       </w:r>
       <w:r>
@@ -4060,7 +3839,7 @@
       <w:pPr>
         <w:pStyle w:val="Heading2"/>
       </w:pPr>
-      <w:bookmarkStart w:id="15" w:name="_Toc242873705"/>
+      <w:bookmarkStart w:id="15" w:name="_Toc242920583"/>
       <w:r>
         <w:rPr>
           <w:rFonts w:ascii="Times New Roman" w:hAnsi="Times New Roman" w:cs="Times New Roman"/>
@@ -4384,12 +4163,11 @@
       <w:pPr>
         <w:pStyle w:val="Heading1"/>
       </w:pPr>
-      <w:bookmarkStart w:id="16" w:name="_Toc242873706"/>
+      <w:bookmarkStart w:id="16" w:name="_Toc242920584"/>
       <w:r>
         <w:rPr>
           <w:rFonts w:ascii="Times New Roman" w:hAnsi="Times New Roman" w:cs="Times New Roman"/>
         </w:rPr>
-        <w:lastRenderedPageBreak/>
         <w:t>4. Experimental setup</w:t>
       </w:r>
       <w:bookmarkEnd w:id="16"/>
@@ -4398,7 +4176,7 @@
       <w:pPr>
         <w:pStyle w:val="Heading2"/>
       </w:pPr>
-      <w:bookmarkStart w:id="17" w:name="_Toc242873707"/>
+      <w:bookmarkStart w:id="17" w:name="_Toc242920585"/>
       <w:r>
         <w:rPr>
           <w:rFonts w:ascii="Times New Roman" w:hAnsi="Times New Roman" w:cs="Times New Roman"/>
@@ -4817,7 +4595,7 @@
       <w:pPr>
         <w:pStyle w:val="Heading2"/>
       </w:pPr>
-      <w:bookmarkStart w:id="18" w:name="_Toc242873708"/>
+      <w:bookmarkStart w:id="18" w:name="_Toc242920586"/>
       <w:r>
         <w:rPr>
           <w:rFonts w:ascii="Times New Roman" w:hAnsi="Times New Roman" w:cs="Times New Roman"/>
@@ -4858,7 +4636,7 @@
       <w:pPr>
         <w:pStyle w:val="Heading2"/>
       </w:pPr>
-      <w:bookmarkStart w:id="19" w:name="_Toc242873709"/>
+      <w:bookmarkStart w:id="19" w:name="_Toc242920587"/>
       <w:r>
         <w:rPr>
           <w:rFonts w:ascii="Times New Roman" w:hAnsi="Times New Roman" w:cs="Times New Roman"/>
@@ -4890,7 +4668,6 @@
         <w:jc w:val="both"/>
       </w:pPr>
       <w:r>
-        <w:lastRenderedPageBreak/>
         <w:t>bootstrap over queries, 2,000 resamples (Efron and Tibshirani, 1993; Sakai, 2006). A difference is called significant only when the 95% percentile interval excludes zero. Latency is wall-clock per query on one machine, reported as a mean, and is used only for cost accounting, never as evidence about algorithmic complexity.</w:t>
       </w:r>
     </w:p>
@@ -4916,7 +4693,7 @@
       <w:pPr>
         <w:pStyle w:val="Heading1"/>
       </w:pPr>
-      <w:bookmarkStart w:id="20" w:name="_Toc242873710"/>
+      <w:bookmarkStart w:id="20" w:name="_Toc242920588"/>
       <w:r>
         <w:rPr>
           <w:rFonts w:ascii="Times New Roman" w:hAnsi="Times New Roman" w:cs="Times New Roman"/>
@@ -4929,7 +4706,7 @@
       <w:pPr>
         <w:pStyle w:val="Heading2"/>
       </w:pPr>
-      <w:bookmarkStart w:id="21" w:name="_Toc242873711"/>
+      <w:bookmarkStart w:id="21" w:name="_Toc242920589"/>
       <w:r>
         <w:rPr>
           <w:rFonts w:ascii="Times New Roman" w:hAnsi="Times New Roman" w:cs="Times New Roman"/>
@@ -5407,12 +5184,11 @@
       <w:pPr>
         <w:pStyle w:val="Heading2"/>
       </w:pPr>
-      <w:bookmarkStart w:id="22" w:name="_Toc242873712"/>
+      <w:bookmarkStart w:id="22" w:name="_Toc242920590"/>
       <w:r>
         <w:rPr>
           <w:rFonts w:ascii="Times New Roman" w:hAnsi="Times New Roman" w:cs="Times New Roman"/>
         </w:rPr>
-        <w:lastRenderedPageBreak/>
         <w:t>5.2 Retrieval quality on the full corpus</w:t>
       </w:r>
       <w:bookmarkEnd w:id="22"/>
@@ -6845,12 +6621,11 @@
       <w:pPr>
         <w:pStyle w:val="Heading2"/>
       </w:pPr>
-      <w:bookmarkStart w:id="23" w:name="_Toc242873713"/>
+      <w:bookmarkStart w:id="23" w:name="_Toc242920591"/>
       <w:r>
         <w:rPr>
           <w:rFonts w:ascii="Times New Roman" w:hAnsi="Times New Roman" w:cs="Times New Roman"/>
         </w:rPr>
-        <w:lastRenderedPageBreak/>
         <w:t>5.3 Grover: query complexity and simulation cost</w:t>
       </w:r>
       <w:bookmarkEnd w:id="23"/>
@@ -7332,18 +7107,14 @@
         <w:t>lower</w:t>
       </w:r>
       <w:r>
-        <w:t xml:space="preserve"> while doing strictly more work. This is measurement </w:t>
-      </w:r>
-      <w:r>
-        <w:lastRenderedPageBreak/>
-        <w:t>noise on a sub-40 ms path, not a speed-up, and we flag it explicitly because a 27.8-to-34.7 comparison is exactly the kind of difference that could be quoted as one. The stage's own cost is 0.057 ms/query, far below the run-to-run variation of the retrieval path it sits in.</w:t>
+        <w:t xml:space="preserve"> while doing strictly more work. This is measurement noise on a sub-40 ms path, not a speed-up, and we flag it explicitly because a 27.8-to-34.7 comparison is exactly the kind of difference that could be quoted as one. The stage's own cost is 0.057 ms/query, far below the run-to-run variation of the retrieval path it sits in.</w:t>
       </w:r>
     </w:p>
     <w:p>
       <w:pPr>
         <w:pStyle w:val="Heading2"/>
       </w:pPr>
-      <w:bookmarkStart w:id="24" w:name="_Toc242873714"/>
+      <w:bookmarkStart w:id="24" w:name="_Toc242920592"/>
       <w:r>
         <w:rPr>
           <w:rFonts w:ascii="Times New Roman" w:hAnsi="Times New Roman" w:cs="Times New Roman"/>
@@ -7943,11 +7714,7 @@
         <w:t>feasible</w:t>
       </w:r>
       <w:r>
-        <w:t xml:space="preserve"> selection after that filtering — roughly 0.40 of measurements are usable and the rest are discarded. On a simulator this is free, because the full distribution is available by construction. On hardware it is not: it implies on the order of 1/0.40 times as many shots to obtain the same decoded answer, and </w:t>
-      </w:r>
-      <w:r>
-        <w:lastRenderedPageBreak/>
-        <w:t>that multiplier is absent from every figure in this table. A quality number quoted without its feasible mass overstates what the routine delivers, so both appear in the same table.</w:t>
+        <w:t xml:space="preserve"> selection after that filtering — roughly 0.40 of measurements are usable and the rest are discarded. On a simulator this is free, because the full distribution is available by construction. On hardware it is not: it implies on the order of 1/0.40 times as many shots to obtain the same decoded answer, and that multiplier is absent from every figure in this table. A quality number quoted without its feasible mass overstates what the routine delivers, so both appear in the same table.</w:t>
       </w:r>
     </w:p>
     <w:p>
@@ -7962,7 +7729,7 @@
       <w:pPr>
         <w:pStyle w:val="Heading2"/>
       </w:pPr>
-      <w:bookmarkStart w:id="25" w:name="_Toc242873715"/>
+      <w:bookmarkStart w:id="25" w:name="_Toc242920593"/>
       <w:r>
         <w:rPr>
           <w:rFonts w:ascii="Times New Roman" w:hAnsi="Times New Roman" w:cs="Times New Roman"/>
@@ -8497,7 +8264,6 @@
         <w:ind w:left="504"/>
       </w:pPr>
       <w:r>
-        <w:lastRenderedPageBreak/>
         <w:t>0.7960 occupancy is a total compromise, not a defended system. All 50 targeted queries are hit (top-10 hit rate 1.0000) and the clean-context rate is 0.0000 — not one targeted query received an uncontaminated context.</w:t>
       </w:r>
     </w:p>
@@ -8535,7 +8301,7 @@
       <w:pPr>
         <w:pStyle w:val="Heading2"/>
       </w:pPr>
-      <w:bookmarkStart w:id="26" w:name="_Toc242873716"/>
+      <w:bookmarkStart w:id="26" w:name="_Toc242920594"/>
       <w:r>
         <w:rPr>
           <w:rFonts w:ascii="Times New Roman" w:hAnsi="Times New Roman" w:cs="Times New Roman"/>
@@ -8564,7 +8330,7 @@
       <w:pPr>
         <w:pStyle w:val="Heading1"/>
       </w:pPr>
-      <w:bookmarkStart w:id="27" w:name="_Toc242873717"/>
+      <w:bookmarkStart w:id="27" w:name="_Toc242920595"/>
       <w:r>
         <w:rPr>
           <w:rFonts w:ascii="Times New Roman" w:hAnsi="Times New Roman" w:cs="Times New Roman"/>
@@ -8577,7 +8343,7 @@
       <w:pPr>
         <w:pStyle w:val="Heading2"/>
       </w:pPr>
-      <w:bookmarkStart w:id="28" w:name="_Toc242873718"/>
+      <w:bookmarkStart w:id="28" w:name="_Toc242920596"/>
       <w:r>
         <w:rPr>
           <w:rFonts w:ascii="Times New Roman" w:hAnsi="Times New Roman" w:cs="Times New Roman"/>
@@ -8591,18 +8357,17 @@
         <w:jc w:val="both"/>
       </w:pPr>
       <w:r>
-        <w:t xml:space="preserve">The retrieval outcome is that 7 configurations, one of which passed two pre-registered criteria on held-out data, produced no significant improvement on 300 queries. Three properties make it worth reporting rather than discarding. The baseline is the same fusion with weight moved onto cosine, so the comparison isolates the kernel. The corpus is the full test split, not a favourable </w:t>
-      </w:r>
-      <w:r>
-        <w:lastRenderedPageBreak/>
-        <w:t>sample. And the criteria were set before training, so the pass in Section 5.1 and the null in Section 5.2 are both on the record, and the gap between them is the finding: a kernel can clear reasonable acceptance criteria on held-out pairs and still not transfer.</w:t>
+        <w:t>The retrieval outcome is that 7 configurations, one of which passed two pre-registered criteria on held-out data, produced no significant improvement on 300 queries. Three properties make it worth reporting rather than discarding. The baseline is the same fusion with weight moved onto cosine, so the comparison isolates the kernel. The corpus is the full test split, not a favourable sample. And the criteria were set before training, so the pass in Section 5.1 and the null in Section 5.2 are both on the recor</w:t>
+      </w:r>
+      <w:r>
+        <w:t>d, and the gap between them is the finding: a kernel can clear reasonable acceptance criteria on held-out pairs and still not transfer.</w:t>
       </w:r>
     </w:p>
     <w:p>
       <w:pPr>
         <w:pStyle w:val="Heading2"/>
       </w:pPr>
-      <w:bookmarkStart w:id="29" w:name="_Toc242873719"/>
+      <w:bookmarkStart w:id="29" w:name="_Toc242920597"/>
       <w:r>
         <w:rPr>
           <w:rFonts w:ascii="Times New Roman" w:hAnsi="Times New Roman" w:cs="Times New Roman"/>
@@ -8626,7 +8391,7 @@
       <w:pPr>
         <w:pStyle w:val="Heading2"/>
       </w:pPr>
-      <w:bookmarkStart w:id="30" w:name="_Toc242873720"/>
+      <w:bookmarkStart w:id="30" w:name="_Toc242920598"/>
       <w:r>
         <w:rPr>
           <w:rFonts w:ascii="Times New Roman" w:hAnsi="Times New Roman" w:cs="Times New Roman"/>
@@ -8655,7 +8420,7 @@
       <w:pPr>
         <w:pStyle w:val="Heading2"/>
       </w:pPr>
-      <w:bookmarkStart w:id="31" w:name="_Toc242873721"/>
+      <w:bookmarkStart w:id="31" w:name="_Toc242920599"/>
       <w:r>
         <w:rPr>
           <w:rFonts w:ascii="Times New Roman" w:hAnsi="Times New Roman" w:cs="Times New Roman"/>
@@ -8686,7 +8451,6 @@
         <w:rPr>
           <w:b/>
         </w:rPr>
-        <w:lastRenderedPageBreak/>
         <w:t>Simulation only.</w:t>
       </w:r>
       <w:r>
@@ -8739,7 +8503,7 @@
       <w:pPr>
         <w:pStyle w:val="Heading1"/>
       </w:pPr>
-      <w:bookmarkStart w:id="32" w:name="_Toc242873722"/>
+      <w:bookmarkStart w:id="32" w:name="_Toc242920600"/>
       <w:r>
         <w:rPr>
           <w:rFonts w:ascii="Times New Roman" w:hAnsi="Times New Roman" w:cs="Times New Roman"/>
@@ -8747,6 +8511,24 @@
         <w:t>7. Reproducibility</w:t>
       </w:r>
       <w:bookmarkEnd w:id="32"/>
+    </w:p>
+    <w:p>
+      <w:pPr>
+        <w:jc w:val="both"/>
+      </w:pPr>
+      <w:r>
+        <w:t xml:space="preserve">The software source is publicly available under the PolyForm Noncommercial License 1.0.0. It is not offered under MIT; permitted uses and distribution are governed by the repository's </w:t>
+      </w:r>
+      <w:r>
+        <w:rPr>
+          <w:rFonts w:ascii="Consolas" w:hAnsi="Consolas" w:cs="Consolas"/>
+          <w:sz w:val="22"/>
+        </w:rPr>
+        <w:t>LICENSE</w:t>
+      </w:r>
+      <w:r>
+        <w:t xml:space="preserve"> file.</w:t>
+      </w:r>
     </w:p>
     <w:p>
       <w:pPr>
@@ -8826,12 +8608,11 @@
       <w:pPr>
         <w:pStyle w:val="Heading1"/>
       </w:pPr>
-      <w:bookmarkStart w:id="33" w:name="_Toc242873723"/>
+      <w:bookmarkStart w:id="33" w:name="_Toc242920601"/>
       <w:r>
         <w:rPr>
           <w:rFonts w:ascii="Times New Roman" w:hAnsi="Times New Roman" w:cs="Times New Roman"/>
         </w:rPr>
-        <w:lastRenderedPageBreak/>
         <w:t>8. Conclusion and further work</w:t>
       </w:r>
       <w:bookmarkEnd w:id="33"/>
@@ -8969,7 +8750,6 @@
         <w:rPr>
           <w:b/>
         </w:rPr>
-        <w:lastRenderedPageBreak/>
         <w:t>A training-set sweep</w:t>
       </w:r>
       <w:r>
@@ -8980,7 +8760,7 @@
       <w:pPr>
         <w:pStyle w:val="Heading1"/>
       </w:pPr>
-      <w:bookmarkStart w:id="34" w:name="_Toc242873724"/>
+      <w:bookmarkStart w:id="34" w:name="_Toc242920602"/>
       <w:r>
         <w:rPr>
           <w:rFonts w:ascii="Times New Roman" w:hAnsi="Times New Roman" w:cs="Times New Roman"/>
@@ -9147,7 +8927,6 @@
         <w:jc w:val="both"/>
       </w:pPr>
       <w:r>
-        <w:lastRenderedPageBreak/>
         <w:t xml:space="preserve">Chen, J., Xiao, S., Zhang, P., Luo, K., Lian, D., and Liu, Z. (2024). BGE M3-Embedding: Multi-lingual, multi-functionality, multi-granularity text embeddings through self-knowledge distillation. In </w:t>
       </w:r>
       <w:r>
@@ -9318,7 +9097,6 @@
         <w:jc w:val="both"/>
       </w:pPr>
       <w:r>
-        <w:lastRenderedPageBreak/>
         <w:t xml:space="preserve">Hastings, M. B. (2019). Classical and quantum bounded depth approximation algorithms. </w:t>
       </w:r>
       <w:r>
@@ -9506,7 +9284,6 @@
         <w:jc w:val="both"/>
       </w:pPr>
       <w:r>
-        <w:lastRenderedPageBreak/>
         <w:t xml:space="preserve">Li, Q., Wang, B., and Melucci, M. (2019). CNM: An interpretable complex-valued network for matching. In </w:t>
       </w:r>
       <w:r>
@@ -9728,7 +9505,6 @@
         <w:jc w:val="both"/>
       </w:pPr>
       <w:r>
-        <w:lastRenderedPageBreak/>
         <w:t xml:space="preserve">Sordoni, A., Nie, J.-Y., and Bengio, Y. (2013). Modeling term dependencies with quantum language models for IR. In </w:t>
       </w:r>
       <w:r>
@@ -9899,7 +9675,6 @@
         <w:jc w:val="both"/>
       </w:pPr>
       <w:r>
-        <w:lastRenderedPageBreak/>
         <w:t xml:space="preserve">Zhang, P., Niu, J., Su, Z., Wang, B., Ma, L., and Song, D. (2018). End-to-end quantum-like language models with application to question answering. In </w:t>
       </w:r>
       <w:r>
@@ -10240,31 +10015,31 @@
       </w:rPr>
     </w:lvl>
   </w:abstractNum>
-  <w:num w:numId="1" w16cid:durableId="98530027">
+  <w:num w:numId="1" w16cid:durableId="1166824706">
     <w:abstractNumId w:val="8"/>
   </w:num>
-  <w:num w:numId="2" w16cid:durableId="1688943014">
+  <w:num w:numId="2" w16cid:durableId="1392312553">
     <w:abstractNumId w:val="6"/>
   </w:num>
-  <w:num w:numId="3" w16cid:durableId="1624193523">
+  <w:num w:numId="3" w16cid:durableId="1527672473">
     <w:abstractNumId w:val="5"/>
   </w:num>
-  <w:num w:numId="4" w16cid:durableId="1739202435">
+  <w:num w:numId="4" w16cid:durableId="1234510397">
     <w:abstractNumId w:val="4"/>
   </w:num>
-  <w:num w:numId="5" w16cid:durableId="1546991342">
+  <w:num w:numId="5" w16cid:durableId="2069571294">
     <w:abstractNumId w:val="7"/>
   </w:num>
-  <w:num w:numId="6" w16cid:durableId="2089570864">
+  <w:num w:numId="6" w16cid:durableId="375859090">
     <w:abstractNumId w:val="3"/>
   </w:num>
-  <w:num w:numId="7" w16cid:durableId="1476988536">
+  <w:num w:numId="7" w16cid:durableId="876508456">
     <w:abstractNumId w:val="2"/>
   </w:num>
-  <w:num w:numId="8" w16cid:durableId="24214389">
+  <w:num w:numId="8" w16cid:durableId="562832423">
     <w:abstractNumId w:val="1"/>
   </w:num>
-  <w:num w:numId="9" w16cid:durableId="1365208320">
+  <w:num w:numId="9" w16cid:durableId="778717102">
     <w:abstractNumId w:val="0"/>
   </w:num>
 </w:numbering>
@@ -21650,7 +21425,7 @@
     <w:autoRedefine/>
     <w:uiPriority w:val="39"/>
     <w:unhideWhenUsed/>
-    <w:rsid w:val="007C1219"/>
+    <w:rsid w:val="00140778"/>
     <w:pPr>
       <w:spacing w:after="100"/>
     </w:pPr>
@@ -21662,7 +21437,7 @@
     <w:autoRedefine/>
     <w:uiPriority w:val="39"/>
     <w:unhideWhenUsed/>
-    <w:rsid w:val="007C1219"/>
+    <w:rsid w:val="00140778"/>
     <w:pPr>
       <w:spacing w:after="100"/>
       <w:ind w:left="240"/>
@@ -21673,7 +21448,7 @@
     <w:basedOn w:val="DefaultParagraphFont"/>
     <w:uiPriority w:val="99"/>
     <w:unhideWhenUsed/>
-    <w:rsid w:val="007C1219"/>
+    <w:rsid w:val="00140778"/>
     <w:rPr>
       <w:color w:val="0000FF" w:themeColor="hyperlink"/>
       <w:u w:val="single"/>

</xml_diff>